<commit_message>
full project: react frontend + express backend + prisma + railway config
</commit_message>
<xml_diff>
--- a/server/templates/child-under-14.docx
+++ b/server/templates/child-under-14.docx
@@ -431,7 +431,7 @@
           <w:sz w:val="24"/>
           <w:shd w:fill="auto" w:val="clear"/>
         </w:rPr>
-        <w:t xml:space="preserve">«_________________________________________________________________________________»</w:t>
+        <w:t xml:space="preserve">«{{courseName}}»</w:t>
       </w:r>
     </w:p>
     <w:p>
@@ -457,7 +457,7 @@
           <w:sz w:val="24"/>
           <w:shd w:fill="auto" w:val="clear"/>
         </w:rPr>
-        <w:t xml:space="preserve">в объёме _____ часов на бюджетной основе с </w:t>
+        <w:t xml:space="preserve">в объёме {{duration}} на бюджетной основе с </w:t>
       </w:r>
       <w:r>
         <w:rPr>
@@ -468,7 +468,7 @@
           <w:sz w:val="24"/>
           <w:shd w:fill="auto" w:val="clear"/>
         </w:rPr>
-        <w:t xml:space="preserve">«______» ________________20    </w:t>
+        <w:t xml:space="preserve">{{startDate}} </w:t>
       </w:r>
       <w:r>
         <w:rPr>
@@ -5538,6 +5538,17 @@
                 <w:position w:val="0"/>
               </w:rPr>
             </w:pPr>
+            <w:r>
+              <w:rPr>
+                <w:rFonts w:ascii="Times New Roman" w:hAnsi="Times New Roman" w:cs="Times New Roman" w:eastAsia="Times New Roman"/>
+                <w:color w:val="auto"/>
+                <w:spacing w:val="0"/>
+                <w:position w:val="0"/>
+                <w:sz w:val="18"/>
+                <w:shd w:fill="auto" w:val="clear"/>
+              </w:rPr>
+              <w:t xml:space="preserve">{{courseName}}</w:t>
+            </w:r>
           </w:p>
         </w:tc>
         <w:tc>
@@ -5570,6 +5581,17 @@
                 <w:shd w:fill="auto" w:val="clear"/>
               </w:rPr>
             </w:pPr>
+            <w:r>
+              <w:rPr>
+                <w:rFonts w:ascii="Times New Roman" w:hAnsi="Times New Roman" w:cs="Times New Roman" w:eastAsia="Times New Roman"/>
+                <w:color w:val="auto"/>
+                <w:spacing w:val="0"/>
+                <w:position w:val="0"/>
+                <w:sz w:val="18"/>
+                <w:shd w:fill="auto" w:val="clear"/>
+              </w:rPr>
+              <w:t xml:space="preserve">{{startDate}}</w:t>
+            </w:r>
           </w:p>
         </w:tc>
         <w:tc>
@@ -5602,6 +5624,17 @@
                 <w:shd w:fill="auto" w:val="clear"/>
               </w:rPr>
             </w:pPr>
+            <w:r>
+              <w:rPr>
+                <w:rFonts w:ascii="Times New Roman" w:hAnsi="Times New Roman" w:cs="Times New Roman" w:eastAsia="Times New Roman"/>
+                <w:color w:val="auto"/>
+                <w:spacing w:val="0"/>
+                <w:position w:val="0"/>
+                <w:sz w:val="18"/>
+                <w:shd w:fill="auto" w:val="clear"/>
+              </w:rPr>
+              <w:t xml:space="preserve">{{endDate}}</w:t>
+            </w:r>
           </w:p>
         </w:tc>
         <w:tc>
@@ -5634,6 +5667,17 @@
                 <w:shd w:fill="auto" w:val="clear"/>
               </w:rPr>
             </w:pPr>
+            <w:r>
+              <w:rPr>
+                <w:rFonts w:ascii="Times New Roman" w:hAnsi="Times New Roman" w:cs="Times New Roman" w:eastAsia="Times New Roman"/>
+                <w:color w:val="auto"/>
+                <w:spacing w:val="0"/>
+                <w:position w:val="0"/>
+                <w:sz w:val="18"/>
+                <w:shd w:fill="auto" w:val="clear"/>
+              </w:rPr>
+              <w:t xml:space="preserve">{{duration}}</w:t>
+            </w:r>
           </w:p>
         </w:tc>
         <w:tc>
@@ -5666,6 +5710,17 @@
                 <w:shd w:fill="auto" w:val="clear"/>
               </w:rPr>
             </w:pPr>
+            <w:r>
+              <w:rPr>
+                <w:rFonts w:ascii="Times New Roman" w:hAnsi="Times New Roman" w:cs="Times New Roman" w:eastAsia="Times New Roman"/>
+                <w:color w:val="auto"/>
+                <w:spacing w:val="0"/>
+                <w:position w:val="0"/>
+                <w:sz w:val="18"/>
+                <w:shd w:fill="auto" w:val="clear"/>
+              </w:rPr>
+              <w:t xml:space="preserve">{{courseFormat}}</w:t>
+            </w:r>
           </w:p>
         </w:tc>
         <w:tc>
@@ -10453,7 +10508,7 @@
           <w:sz w:val="24"/>
           <w:shd w:fill="auto" w:val="clear"/>
         </w:rPr>
-        <w:t xml:space="preserve">«_________________________________________________________________________________»</w:t>
+        <w:t xml:space="preserve">«{{courseName}}»</w:t>
       </w:r>
     </w:p>
     <w:p>
@@ -10479,7 +10534,7 @@
           <w:sz w:val="24"/>
           <w:shd w:fill="auto" w:val="clear"/>
         </w:rPr>
-        <w:t xml:space="preserve">в объёме _____ часов на бюджетной основе с </w:t>
+        <w:t xml:space="preserve">в объёме {{duration}} на бюджетной основе с </w:t>
       </w:r>
       <w:r>
         <w:rPr>
@@ -10490,7 +10545,7 @@
           <w:sz w:val="24"/>
           <w:shd w:fill="auto" w:val="clear"/>
         </w:rPr>
-        <w:t xml:space="preserve">«______» ________________20    </w:t>
+        <w:t xml:space="preserve">{{startDate}} </w:t>
       </w:r>
       <w:r>
         <w:rPr>
@@ -15394,6 +15449,17 @@
                 <w:position w:val="0"/>
               </w:rPr>
             </w:pPr>
+            <w:r>
+              <w:rPr>
+                <w:rFonts w:ascii="Times New Roman" w:hAnsi="Times New Roman" w:cs="Times New Roman" w:eastAsia="Times New Roman"/>
+                <w:color w:val="auto"/>
+                <w:spacing w:val="0"/>
+                <w:position w:val="0"/>
+                <w:sz w:val="18"/>
+                <w:shd w:fill="auto" w:val="clear"/>
+              </w:rPr>
+              <w:t xml:space="preserve">{{courseName}}</w:t>
+            </w:r>
           </w:p>
         </w:tc>
         <w:tc>
@@ -15426,6 +15492,17 @@
                 <w:shd w:fill="auto" w:val="clear"/>
               </w:rPr>
             </w:pPr>
+            <w:r>
+              <w:rPr>
+                <w:rFonts w:ascii="Times New Roman" w:hAnsi="Times New Roman" w:cs="Times New Roman" w:eastAsia="Times New Roman"/>
+                <w:color w:val="auto"/>
+                <w:spacing w:val="0"/>
+                <w:position w:val="0"/>
+                <w:sz w:val="18"/>
+                <w:shd w:fill="auto" w:val="clear"/>
+              </w:rPr>
+              <w:t xml:space="preserve">{{startDate}}</w:t>
+            </w:r>
           </w:p>
         </w:tc>
         <w:tc>
@@ -15458,6 +15535,17 @@
                 <w:shd w:fill="auto" w:val="clear"/>
               </w:rPr>
             </w:pPr>
+            <w:r>
+              <w:rPr>
+                <w:rFonts w:ascii="Times New Roman" w:hAnsi="Times New Roman" w:cs="Times New Roman" w:eastAsia="Times New Roman"/>
+                <w:color w:val="auto"/>
+                <w:spacing w:val="0"/>
+                <w:position w:val="0"/>
+                <w:sz w:val="18"/>
+                <w:shd w:fill="auto" w:val="clear"/>
+              </w:rPr>
+              <w:t xml:space="preserve">{{endDate}}</w:t>
+            </w:r>
           </w:p>
         </w:tc>
         <w:tc>
@@ -15490,6 +15578,17 @@
                 <w:shd w:fill="auto" w:val="clear"/>
               </w:rPr>
             </w:pPr>
+            <w:r>
+              <w:rPr>
+                <w:rFonts w:ascii="Times New Roman" w:hAnsi="Times New Roman" w:cs="Times New Roman" w:eastAsia="Times New Roman"/>
+                <w:color w:val="auto"/>
+                <w:spacing w:val="0"/>
+                <w:position w:val="0"/>
+                <w:sz w:val="18"/>
+                <w:shd w:fill="auto" w:val="clear"/>
+              </w:rPr>
+              <w:t xml:space="preserve">{{duration}}</w:t>
+            </w:r>
           </w:p>
         </w:tc>
         <w:tc>
@@ -15522,6 +15621,17 @@
                 <w:shd w:fill="auto" w:val="clear"/>
               </w:rPr>
             </w:pPr>
+            <w:r>
+              <w:rPr>
+                <w:rFonts w:ascii="Times New Roman" w:hAnsi="Times New Roman" w:cs="Times New Roman" w:eastAsia="Times New Roman"/>
+                <w:color w:val="auto"/>
+                <w:spacing w:val="0"/>
+                <w:position w:val="0"/>
+                <w:sz w:val="18"/>
+                <w:shd w:fill="auto" w:val="clear"/>
+              </w:rPr>
+              <w:t xml:space="preserve">{{courseFormat}}</w:t>
+            </w:r>
           </w:p>
         </w:tc>
         <w:tc>

</xml_diff>